<commit_message>
add: technical doc; fix: message of error
</commit_message>
<xml_diff>
--- a/Официальная техническая документация.docx
+++ b/Официальная техническая документация.docx
@@ -44,6 +44,14 @@
           <w:bCs/>
         </w:rPr>
         <w:t>1. Описание проекта</w:t>
+      </w:r>
+      <w:r>
+        <w:rPr>
+          <w:rFonts w:ascii="Times New Roman" w:hAnsi="Times New Roman" w:cs="Times New Roman"/>
+          <w:b/>
+          <w:bCs/>
+        </w:rPr>
+        <w:t xml:space="preserve"> </w:t>
       </w:r>
     </w:p>
     <w:p>
@@ -1988,6 +1996,7 @@
           <w:rFonts w:ascii="Times New Roman" w:hAnsi="Times New Roman" w:cs="Times New Roman"/>
           <w:b/>
           <w:bCs/>
+          <w:lang w:val="en-US"/>
         </w:rPr>
         <w:t xml:space="preserve"> 2. </w:t>
       </w:r>
@@ -2965,6 +2974,7 @@
       <w:r>
         <w:rPr>
           <w:rFonts w:ascii="Times New Roman" w:hAnsi="Times New Roman" w:cs="Times New Roman"/>
+          <w:noProof/>
         </w:rPr>
         <w:drawing>
           <wp:inline distT="0" distB="0" distL="0" distR="0" wp14:anchorId="716FFDF1" wp14:editId="0D67B3F4">
@@ -3122,6 +3132,7 @@
       <w:r>
         <w:rPr>
           <w:rFonts w:ascii="Times New Roman" w:hAnsi="Times New Roman" w:cs="Times New Roman"/>
+          <w:noProof/>
         </w:rPr>
         <w:drawing>
           <wp:inline distT="0" distB="0" distL="0" distR="0" wp14:anchorId="23926C68" wp14:editId="1C27BECD">
@@ -3400,19 +3411,7 @@
         <w:rPr>
           <w:rFonts w:ascii="Times New Roman" w:hAnsi="Times New Roman" w:cs="Times New Roman"/>
         </w:rPr>
-        <w:t xml:space="preserve"> (http://127.0.0.1:11434/v1/chat/completions) либо</w:t>
-      </w:r>
-      <w:r>
-        <w:rPr>
-          <w:rFonts w:ascii="Times New Roman" w:hAnsi="Times New Roman" w:cs="Times New Roman"/>
-        </w:rPr>
-        <w:t xml:space="preserve"> </w:t>
-      </w:r>
-      <w:r>
-        <w:rPr>
-          <w:rFonts w:ascii="Times New Roman" w:hAnsi="Times New Roman" w:cs="Times New Roman"/>
-        </w:rPr>
-        <w:t xml:space="preserve">(http://host.docker.internal:11434/v1/chat/completions), если веб-ядро запущено в </w:t>
+        <w:t xml:space="preserve"> (http://127.0.0.1:11434/v1/chat/completions) либо (http://host.docker.internal:11434/v1/chat/completions), если веб-ядро запущено в </w:t>
       </w:r>
       <w:proofErr w:type="spellStart"/>
       <w:r>
@@ -4156,6 +4155,9 @@
         <w:pStyle w:val="ae"/>
       </w:pPr>
       <w:r>
+        <w:rPr>
+          <w:noProof/>
+        </w:rPr>
         <w:drawing>
           <wp:inline distT="0" distB="0" distL="0" distR="0" wp14:anchorId="3E11BFED" wp14:editId="27B12CB8">
             <wp:extent cx="2289039" cy="1873250"/>

</xml_diff>